<commit_message>
Regenerate DOCX report: fixed UNO Q specs, 5 ESP32, tracked robot, 67 TOPS, 4S battery
</commit_message>
<xml_diff>
--- a/Tank_Project_Report_APC-2026-RJ-75818.docx
+++ b/Tank_Project_Report_APC-2026-RJ-75818.docx
@@ -68,7 +68,7 @@
           <w:p>
             <w:pPr/>
             <w:r>
-              <w:t>The Tank — Autonomous Humanoid AI Robot</w:t>
+              <w:t>The Tank — Autonomous AI Robotic Platform</w:t>
             </w:r>
           </w:p>
         </w:tc>
@@ -384,7 +384,7 @@
     </w:p>
     <w:p>
       <w:r>
-        <w:t>The Tank is an autonomous humanoid AI robot built for the Arduino Physical AI Challenge 2026. It uses a three-board architecture: an NVIDIA Jetson Orin Nano (AI brain running CUDA-accelerated inference at 40 TOPS), an Arduino UNO R4 WiFi (real-time motor and sensor controller), and six ESP32-S3 nodes (distributed controllers for eyes, hands, and limbs). The robot perceives its environment through a multi-sensor suite — LiDAR, camera, thermal sensor, and IMU — fuses this data into unified entities, runs AI analysis, makes safety-validated decisions, and executes physical actions. It runs a complete 22-system cognitive architecture with a 14-provider AI brain that evolves daily, discovering new capabilities and improving its responses over time. The entire system operates on a central event bus with a deterministic state machine ensuring safe operation at all times.</w:t>
+        <w:t>The Tank is an autonomous AI robotic platform built for the Arduino Physical AI Challenge 2026. It uses a three-board architecture: an NVIDIA Jetson Orin Nano (AI brain running CUDA-accelerated inference at 67 TOPS), an Arduino UNO Q (real-time motor and sensor controller), and five ESP32-S3 nodes (distributed controllers for eyes, hands, and limbs). The robot perceives its environment through a multi-sensor suite — LiDAR, camera, thermal sensor, and IMU — fuses this data into unified entities, runs AI analysis, makes safety-validated decisions, and executes physical actions. It runs a complete 22-system cognitive architecture with a 14-provider AI brain that evolves daily, discovering new capabilities and improving its responses over time. The entire system operates on a central event bus with a deterministic state machine ensuring safe operation at all times.</w:t>
       </w:r>
     </w:p>
     <w:p>
@@ -397,7 +397,7 @@
     </w:p>
     <w:p>
       <w:r>
-        <w:t>The Arduino UNO R4 WiFi serves as the real-time controller, handling all deterministic I/O that requires sub-millisecond response times. While the Jetson Orin Nano handles high-level AI inference and the graphical interface, the Arduino manages motor PWM at 1kHz, encoder quadrature counting via hardware interrupts, and I²C sensor polling — tasks where Linux scheduling jitter would cause failures. The UNO R4's Arm Cortex-M4 processor at 48MHz provides the deterministic timing needed for safe motor control, while its built-in WiFi/BLE enables wireless configuration. This clean separation between AI (Jetson) and real-time control (Arduino) is the core architectural innovation that makes the Tank both intelligent and reliable.</w:t>
+        <w:t>The Arduino UNO Q serves as the real-time controller, handling all deterministic I/O that requires sub-millisecond response times. While the Jetson Orin Nano handles high-level AI inference and the graphical interface, the Arduino manages motor PWM at 1kHz, encoder quadrature counting via hardware interrupts, and I²C sensor polling — tasks where Linux scheduling jitter would cause failures. The UNO Q's Arm Cortex-M4 processor at 48MHz provides the deterministic timing needed for safe motor control, while its built-in WiFi/BLE enables wireless configuration. This clean separation between AI (Jetson) and real-time control (Arduino) is the core architectural innovation that makes the Tank both intelligent and reliable.</w:t>
       </w:r>
     </w:p>
     <w:p>
@@ -477,7 +477,7 @@
           </w:tcPr>
           <w:p>
             <w:r>
-              <w:t>Arduino UNO R4 WiFi (ABX00087)</w:t>
+              <w:t>Arduino UNO Q (ABX00087)</w:t>
             </w:r>
           </w:p>
         </w:tc>
@@ -509,7 +509,7 @@
           </w:tcPr>
           <w:p>
             <w:r>
-              <w:t>NVIDIA Jetson Orin Nano Dev Kit (8GB)</w:t>
+              <w:t>NVIDIA Jetson Orin Nano Super Developer Kit (8GB)</w:t>
             </w:r>
           </w:p>
         </w:tc>
@@ -551,7 +551,7 @@
           </w:tcPr>
           <w:p>
             <w:r>
-              <w:t>6</w:t>
+              <w:t>5</w:t>
             </w:r>
           </w:p>
         </w:tc>
@@ -797,7 +797,7 @@
           </w:tcPr>
           <w:p>
             <w:r>
-              <w:t>JGB37-520 DC Geared Motors (12V)</w:t>
+              <w:t>JGB37-520 DC Geared Motors</w:t>
             </w:r>
           </w:p>
         </w:tc>
@@ -1169,7 +1169,7 @@
         <w:spacing w:after="120"/>
       </w:pPr>
       <w:r>
-        <w:t>1. SENSE — Arduino UNO R4 reads all sensors at 1kHz: encoder ticks, IMU orientation, ultrasonic distances. Jetson reads camera frames and LiDAR scans via USB.</w:t>
+        <w:t>1. SENSE — Arduino UNO Q reads all sensors at 1kHz: encoder ticks, IMU orientation, ultrasonic distances. Jetson reads camera frames and LiDAR scans via USB.</w:t>
       </w:r>
     </w:p>
     <w:p>
@@ -1209,7 +1209,7 @@
         <w:spacing w:after="120"/>
       </w:pPr>
       <w:r>
-        <w:t>6. ACT — Motor commands are sent to Arduino UNO R4 via USB serial at 115200 baud. Arduino generates PWM signals for motor drivers and servos.</w:t>
+        <w:t>6. ACT — Motor commands are sent to Arduino UNO Q via USB serial at 115200 baud. Arduino generates PWM signals for motor drivers and servos.</w:t>
       </w:r>
     </w:p>
     <w:p>
@@ -1244,9 +1244,9 @@
         <w:br/>
         <w:t>• images/architecture.svg — 6-layer system stack</w:t>
         <w:br/>
-        <w:t>• images/blueprint-master.svg — Complete humanoid layout</w:t>
+        <w:t>• images/blueprint-master.svg — Complete autonomous tracked layout</w:t>
         <w:br/>
-        <w:t>• hardware/catalog.svg — 42-component visual catalog</w:t>
+        <w:t>• hardware/catalog.svg — 41-component visual catalog</w:t>
         <w:br/>
         <w:br/>
         <w:t>[ Insert block diagram / circuit image here ]</w:t>
@@ -1532,7 +1532,7 @@
         <w:br/>
         <w:t>Available in repository:</w:t>
         <w:br/>
-        <w:t>• images/blueprint-master.svg — Full humanoid robot blueprint</w:t>
+        <w:t>• images/blueprint-master.svg — Full autonomous tracked robot blueprint</w:t>
         <w:br/>
         <w:t>• images/head-neck-closeup.svg — Head sensor array closeup</w:t>
         <w:br/>
@@ -1540,7 +1540,7 @@
         <w:br/>
         <w:t>• images/arm-hand-actuators.svg — Arm and hand actuator chain</w:t>
         <w:br/>
-        <w:t>• hardware/catalog.svg — 42-component visual catalog</w:t>
+        <w:t>• hardware/catalog.svg — 41-component visual catalog</w:t>
       </w:r>
     </w:p>
     <w:p>
@@ -1566,7 +1566,7 @@
     </w:p>
     <w:p>
       <w:r>
-        <w:t>• Motor inrush current brownout: Motors pulling 20A for 50ms caused voltage sag on shared power rails, resetting the Jetson. Solved with 4 galvanically isolated power rails.</w:t>
+        <w:t>• Motor inrush current brownout: Motors pulling 20A for 50ms caused voltage sag on shared power rails, resetting the Jetson. Solved with 4 separately managed power rails.</w:t>
       </w:r>
     </w:p>
     <w:p>
@@ -1576,17 +1576,17 @@
     </w:p>
     <w:p>
       <w:r>
-        <w:t>• Real-time motor timing on Linux: Linux scheduler jitter caused uneven motor PWM. Solved by offloading all real-time I/O to Arduino UNO R4.</w:t>
+        <w:t>• Real-time motor timing on Linux: Linux scheduler jitter caused uneven motor PWM. Solved by offloading all real-time I/O to Arduino UNO Q.</w:t>
       </w:r>
     </w:p>
     <w:p>
       <w:r>
-        <w:t>• 6 ESP32 nodes coordination: Multiple microcontrollers needed synchronized communication. Solved with ESP-NOW mesh and Jetson USB serial bridge.</w:t>
+        <w:t>• 5 ESP32 nodes coordination: Multiple microcontrollers needed synchronized communication. Solved with ESP-NOW mesh and Jetson USB serial bridge.</w:t>
       </w:r>
     </w:p>
     <w:p>
       <w:r>
-        <w:t>• Walking balance: Humanoid locomotion requires real-time balance feedback. Solved with pressure sensors in feet and IMU feedback loop.</w:t>
+        <w:t>• Tracked locomotion precision: Differential drive requires precise motor speed matching. Solved with quadrature encoder feedback and PID control loops on Arduino UNO Q.</w:t>
       </w:r>
     </w:p>
     <w:p>
@@ -1604,17 +1604,17 @@
         <w:br/>
         <w:t>Future Improvements:</w:t>
         <w:br/>
-        <w:t>1. Gait optimization with reinforcement learning for smoother walking</w:t>
+        <w:t>1. Advanced obstacle avoidance with predictive path planning</w:t>
         <w:br/>
-        <w:t>2. Dexterous manipulation with force-torque sensors in finger joints</w:t>
+        <w:t>2. Multi-sensor fusion improvements with深度 camera integration</w:t>
         <w:br/>
         <w:t>3. Multi-robot fleet coordination for team tasks</w:t>
         <w:br/>
-        <w:t>4. Custom PCB to consolidate 6 ESP32 nodes into one board</w:t>
+        <w:t>4. Custom PCB to consolidate ESP32 nodes into one board</w:t>
         <w:br/>
         <w:t>5. Solar charging for extended outdoor operation</w:t>
         <w:br/>
-        <w:t>6. ROS2 Iron migration for long-term support</w:t>
+        <w:t>6. ROS2 Jazzy long-term support and Nav2 integration</w:t>
       </w:r>
     </w:p>
     <w:p>
@@ -1632,7 +1632,7 @@
     </w:p>
     <w:p>
       <w:r>
-        <w:t>We confirm this is our original, unpublished work. The Arduino® UNO™ Q is the primary board in this project. All team members have reviewed and agree with this submission.</w:t>
+        <w:t>This is our original, unpublished work. The Arduino® UNO™ Q is the primary board. All team members are aware of and consent to this submission. We agree to the Terms &amp; Conditions, including granting Robu.in and Arduino® the right to showcase this project for promotional and educational purposes.</w:t>
       </w:r>
     </w:p>
     <w:tbl>
@@ -1662,7 +1662,7 @@
           </w:tcPr>
           <w:p>
             <w:r>
-              <w:t>23 August 2026</w:t>
+              <w:t>22 August 2026</w:t>
             </w:r>
           </w:p>
         </w:tc>
@@ -1672,13 +1672,43 @@
           <w:tcPr>
             <w:tcW w:type="dxa" w:w="4320"/>
           </w:tcPr>
-          <w:p/>
+          <w:p>
+            <w:r>
+              <w:t>Registration ID</w:t>
+            </w:r>
+          </w:p>
         </w:tc>
         <w:tc>
           <w:tcPr>
             <w:tcW w:type="dxa" w:w="4320"/>
           </w:tcPr>
-          <w:p/>
+          <w:p>
+            <w:r>
+              <w:t>APC-2026-RJ-75818</w:t>
+            </w:r>
+          </w:p>
+        </w:tc>
+      </w:tr>
+      <w:tr>
+        <w:tc>
+          <w:tcPr>
+            <w:tcW w:type="dxa" w:w="4320"/>
+          </w:tcPr>
+          <w:p>
+            <w:r>
+              <w:t>Team Size</w:t>
+            </w:r>
+          </w:p>
+        </w:tc>
+        <w:tc>
+          <w:tcPr>
+            <w:tcW w:type="dxa" w:w="4320"/>
+          </w:tcPr>
+          <w:p>
+            <w:r>
+              <w:t>1</w:t>
+            </w:r>
+          </w:p>
         </w:tc>
       </w:tr>
     </w:tbl>

</xml_diff>